<commit_message>
Add DOCX download link and fix header line breaks
Split version line onto its own row in policy header and add
a download link for the DOCX companion file.
</commit_message>
<xml_diff>
--- a/policies/aec/AI-Acceptable-Use-Policy-AEC.docx
+++ b/policies/aec/AI-Acceptable-Use-Policy-AEC.docx
@@ -44,7 +44,22 @@
           <w:color w:val="666666"/>
           <w:sz w:val="20"/>
         </w:rPr>
-        <w:t>Version 1.0 — March 2026 | Free to use</w:t>
+        <w:t>Version 1.0 — March 2026</w:t>
+      </w:r>
+    </w:p>
+    <w:p>
+      <w:pPr>
+        <w:spacing w:before="120" w:after="120"/>
+      </w:pPr>
+      <w:r>
+        <w:rPr>
+          <w:rFonts w:ascii="Arial" w:hAnsi="Arial"/>
+          <w:b w:val="0"/>
+          <w:i w:val="0"/>
+          <w:color w:val="333333"/>
+          <w:sz w:val="21"/>
+        </w:rPr>
+        <w:t>*Free to use* | Download DOCX version</w:t>
       </w:r>
     </w:p>
     <w:p>

</xml_diff>

<commit_message>
Fix DOCX rendering: clean header, add attribution hyperlinks
Strip <br> tags and Download DOCX link from generated DOCX output,
render italic text without raw markdown asterisks, and add clickable
hyperlinks for Open IT Policy Library and Sorted Solution in the
document attribution footer.
</commit_message>
<xml_diff>
--- a/policies/aec/AI-Acceptable-Use-Policy-AEC.docx
+++ b/policies/aec/AI-Acceptable-Use-Policy-AEC.docx
@@ -29,7 +29,7 @@
           <w:color w:val="666666"/>
           <w:sz w:val="22"/>
         </w:rPr>
-        <w:t>Open IT Policy Library for AEC by Sorted Solution | sortedsolution.com&lt;br&gt;</w:t>
+        <w:t>Open IT Policy Library for AEC by Sorted Solution | sortedsolution.com</w:t>
       </w:r>
     </w:p>
     <w:p>
@@ -49,17 +49,17 @@
     </w:p>
     <w:p>
       <w:pPr>
-        <w:spacing w:before="120" w:after="120"/>
+        <w:spacing w:after="200"/>
       </w:pPr>
       <w:r>
         <w:rPr>
           <w:rFonts w:ascii="Arial" w:hAnsi="Arial"/>
           <w:b w:val="0"/>
-          <w:i w:val="0"/>
-          <w:color w:val="333333"/>
-          <w:sz w:val="21"/>
+          <w:i/>
+          <w:color w:val="666666"/>
+          <w:sz w:val="20"/>
         </w:rPr>
-        <w:t>*Free to use* | Download DOCX version</w:t>
+        <w:t>Free to use</w:t>
       </w:r>
     </w:p>
     <w:p>
@@ -3846,7 +3846,51 @@
           <w:color w:val="333333"/>
           <w:sz w:val="21"/>
         </w:rPr>
-        <w:t>This policy is part of the Open IT Policy Library for AEC by Sorted Solution. Free to use, fork, and adapt. Attribution appreciated.</w:t>
+        <w:t xml:space="preserve">This policy is part of the </w:t>
+      </w:r>
+      <w:hyperlink r:id="rId11">
+        <w:r>
+          <w:rPr>
+            <w:rFonts w:ascii="Arial" w:hAnsi="Arial"/>
+            <w:sz w:val="21"/>
+            <w:color w:val="2B579A"/>
+            <w:u w:val="single"/>
+            <w:i/>
+          </w:rPr>
+          <w:t xml:space="preserve">Open IT Policy Library for AEC</w:t>
+        </w:r>
+      </w:hyperlink>
+      <w:r>
+        <w:rPr>
+          <w:rFonts w:ascii="Arial" w:hAnsi="Arial"/>
+          <w:b w:val="0"/>
+          <w:i/>
+          <w:color w:val="333333"/>
+          <w:sz w:val="21"/>
+        </w:rPr>
+        <w:t xml:space="preserve"> by </w:t>
+      </w:r>
+      <w:hyperlink r:id="rId12">
+        <w:r>
+          <w:rPr>
+            <w:rFonts w:ascii="Arial" w:hAnsi="Arial"/>
+            <w:sz w:val="21"/>
+            <w:color w:val="2B579A"/>
+            <w:u w:val="single"/>
+            <w:i/>
+          </w:rPr>
+          <w:t xml:space="preserve">Sorted Solution</w:t>
+        </w:r>
+      </w:hyperlink>
+      <w:r>
+        <w:rPr>
+          <w:rFonts w:ascii="Arial" w:hAnsi="Arial"/>
+          <w:b w:val="0"/>
+          <w:i/>
+          <w:color w:val="333333"/>
+          <w:sz w:val="21"/>
+        </w:rPr>
+        <w:t>. Free to use, fork, and adapt. Attribution appreciated.</w:t>
       </w:r>
     </w:p>
     <w:sectPr>
@@ -3870,16 +3914,17 @@
         <w:tab w:pos="9360" w:val="right"/>
       </w:tabs>
     </w:pPr>
-    <w:r>
-      <w:rPr>
-        <w:rFonts w:ascii="Arial" w:hAnsi="Arial"/>
-        <w:b w:val="0"/>
-        <w:i w:val="0"/>
-        <w:color w:val="666666"/>
-        <w:sz w:val="16"/>
-      </w:rPr>
-      <w:t>sortedsolution.com/oitpl</w:t>
-    </w:r>
+    <w:hyperlink r:id="rId1">
+      <w:r>
+        <w:rPr>
+          <w:rFonts w:ascii="Arial" w:hAnsi="Arial"/>
+          <w:sz w:val="16"/>
+          <w:color w:val="666666"/>
+          <w:u w:val="single"/>
+        </w:rPr>
+        <w:t xml:space="preserve">sortedsolution.com/oitpl</w:t>
+      </w:r>
+    </w:hyperlink>
     <w:r>
       <w:rPr>
         <w:rFonts w:ascii="Arial" w:hAnsi="Arial"/>

</xml_diff>

<commit_message>
Fix GitHub repo link rendering in DOCX header
</commit_message>
<xml_diff>
--- a/policies/aec/AI-Acceptable-Use-Policy-AEC.docx
+++ b/policies/aec/AI-Acceptable-Use-Policy-AEC.docx
@@ -59,7 +59,28 @@
           <w:color w:val="666666"/>
           <w:sz w:val="20"/>
         </w:rPr>
-        <w:t>Free to use, fork, and adapt at [github.com/sortedsol/Open-IT-Policy-Library](https://github.com/sortedsol/Open-IT-Policy-Library)</w:t>
+        <w:t xml:space="preserve">Free to use, fork, and adapt at </w:t>
+      </w:r>
+      <w:hyperlink r:id="rId11">
+        <w:r>
+          <w:rPr>
+            <w:rFonts w:ascii="Arial" w:hAnsi="Arial"/>
+            <w:sz w:val="20"/>
+            <w:color w:val="2B579A"/>
+            <w:u w:val="single"/>
+            <w:i/>
+          </w:rPr>
+          <w:t xml:space="preserve">github.com/sortedsol/Open-IT-Policy-Library</w:t>
+        </w:r>
+      </w:hyperlink>
+      <w:r>
+        <w:rPr>
+          <w:rFonts w:ascii="Arial" w:hAnsi="Arial"/>
+          <w:b w:val="0"/>
+          <w:i/>
+          <w:color w:val="666666"/>
+          <w:sz w:val="20"/>
+        </w:rPr>
       </w:r>
     </w:p>
     <w:p>

</xml_diff>

<commit_message>
Convert admin-directed blockquotes to Zensical admonitions across all policies
Replaced > **Firms:**/Companies:** blockquotes with !!! tip "Firm administrators" /
"Company administrators" admonitions for clear visual callout on the website.
Added !!! warning "Important" for IRP framework notices.
Updated DOCX generator to parse and render admonition blocks with styled callout boxes.
Regenerated all DOCX files.
</commit_message>
<xml_diff>
--- a/policies/aec/AI-Acceptable-Use-Policy-AEC.docx
+++ b/policies/aec/AI-Acceptable-Use-Policy-AEC.docx
@@ -993,40 +993,64 @@
         <w:spacing w:before="40" w:after="40"/>
       </w:pPr>
     </w:p>
+    <w:tbl>
+      <w:tblPr>
+        <w:jc w:val="center"/>
+        <w:tblLook w:firstColumn="1" w:firstRow="1" w:lastColumn="0" w:lastRow="0" w:noHBand="0" w:noVBand="1" w:val="04A0"/>
+        <w:tblW w:w="9360" w:type="dxa"/>
+      </w:tblPr>
+      <w:tblGrid>
+        <w:gridCol w:w="9360"/>
+      </w:tblGrid>
+      <w:tr>
+        <w:tc>
+          <w:tcPr>
+            <w:tcW w:type="dxa" w:w="9360"/>
+            <w:shd w:fill="E8F4E8" w:val="clear"/>
+            <w:tcBorders>
+              <w:left w:val="single" w:sz="24" w:space="0" w:color="2E7D32"/>
+              <w:top w:val="single" w:sz="4" w:space="0" w:color="E8F4E8"/>
+              <w:bottom w:val="single" w:sz="4" w:space="0" w:color="E8F4E8"/>
+              <w:right w:val="single" w:sz="4" w:space="0" w:color="E8F4E8"/>
+            </w:tcBorders>
+          </w:tcPr>
+          <w:p>
+            <w:pPr>
+              <w:spacing w:before="80" w:after="120"/>
+            </w:pPr>
+            <w:r>
+              <w:rPr>
+                <w:rFonts w:ascii="Arial" w:hAnsi="Arial"/>
+                <w:b/>
+                <w:i w:val="0"/>
+                <w:color w:val="2E7D32"/>
+                <w:sz w:val="21"/>
+              </w:rPr>
+              <w:t>Firm administrators</w:t>
+            </w:r>
+          </w:p>
+          <w:p>
+            <w:pPr>
+              <w:spacing w:before="40" w:after="40"/>
+            </w:pPr>
+            <w:r>
+              <w:rPr>
+                <w:rFonts w:ascii="Arial" w:hAnsi="Arial"/>
+                <w:b w:val="0"/>
+                <w:i w:val="0"/>
+                <w:color w:val="333333"/>
+                <w:sz w:val="20"/>
+              </w:rPr>
+              <w:t>Update this table to match your actual subscriptions. A tool is only Tier 1 if your firm has the specific license that includes enterprise data protections and IT has set it up and approved it.</w:t>
+            </w:r>
+          </w:p>
+        </w:tc>
+      </w:tr>
+    </w:tbl>
     <w:p>
       <w:pPr>
-        <w:spacing w:before="120" w:after="120"/>
-        <w:ind w:left="360"/>
-      </w:pPr>
-      <w:r>
-        <w:rPr>
-          <w:rFonts w:ascii="Arial" w:hAnsi="Arial"/>
-          <w:b w:val="0"/>
-          <w:i/>
-          <w:color w:val="666666"/>
-          <w:sz w:val="20"/>
-        </w:rPr>
-      </w:r>
-      <w:r>
-        <w:rPr>
-          <w:rFonts w:ascii="Arial" w:hAnsi="Arial"/>
-          <w:b/>
-          <w:i w:val="0"/>
-          <w:color w:val="666666"/>
-          <w:sz w:val="20"/>
-        </w:rPr>
-        <w:t>Firm administrators:</w:t>
-      </w:r>
-      <w:r>
-        <w:rPr>
-          <w:rFonts w:ascii="Arial" w:hAnsi="Arial"/>
-          <w:b w:val="0"/>
-          <w:i/>
-          <w:color w:val="666666"/>
-          <w:sz w:val="20"/>
-        </w:rPr>
-        <w:t xml:space="preserve"> Update this table to match your actual subscriptions. A tool is only Tier 1 if your firm has the specific license that includes enterprise data protections and IT has set it up and approved it.</w:t>
-      </w:r>
+        <w:spacing w:before="40" w:after="40"/>
+      </w:pPr>
     </w:p>
     <w:p>
       <w:pPr>
@@ -2121,184 +2145,244 @@
         <w:t>You are responsible for anything you put your name on, no matter how it was produced. AI-generated content in stamped or sealed documents must never stand on its own — the professional of record must independently verify it.</w:t>
       </w:r>
     </w:p>
+    <w:tbl>
+      <w:tblPr>
+        <w:jc w:val="center"/>
+        <w:tblLook w:firstColumn="1" w:firstRow="1" w:lastColumn="0" w:lastRow="0" w:noHBand="0" w:noVBand="1" w:val="04A0"/>
+        <w:tblW w:w="9360" w:type="dxa"/>
+      </w:tblPr>
+      <w:tblGrid>
+        <w:gridCol w:w="9360"/>
+      </w:tblGrid>
+      <w:tr>
+        <w:tc>
+          <w:tcPr>
+            <w:tcW w:type="dxa" w:w="9360"/>
+            <w:shd w:fill="E8F4E8" w:val="clear"/>
+            <w:tcBorders>
+              <w:left w:val="single" w:sz="24" w:space="0" w:color="2E7D32"/>
+              <w:top w:val="single" w:sz="4" w:space="0" w:color="E8F4E8"/>
+              <w:bottom w:val="single" w:sz="4" w:space="0" w:color="E8F4E8"/>
+              <w:right w:val="single" w:sz="4" w:space="0" w:color="E8F4E8"/>
+            </w:tcBorders>
+          </w:tcPr>
+          <w:p>
+            <w:pPr>
+              <w:spacing w:before="80" w:after="120"/>
+            </w:pPr>
+            <w:r>
+              <w:rPr>
+                <w:rFonts w:ascii="Arial" w:hAnsi="Arial"/>
+                <w:b/>
+                <w:i w:val="0"/>
+                <w:color w:val="2E7D32"/>
+                <w:sz w:val="21"/>
+              </w:rPr>
+              <w:t>Firm administrators</w:t>
+            </w:r>
+          </w:p>
+          <w:p>
+            <w:pPr>
+              <w:spacing w:before="40" w:after="40"/>
+            </w:pPr>
+            <w:r>
+              <w:rPr>
+                <w:rFonts w:ascii="Arial" w:hAnsi="Arial"/>
+                <w:b w:val="0"/>
+                <w:i w:val="0"/>
+                <w:color w:val="333333"/>
+                <w:sz w:val="20"/>
+              </w:rPr>
+              <w:t>Define your review requirements based on your practice areas and risk tolerance. Some insurance carriers are issuing specific guidance on AI-generated work product — check with your broker. At a minimum, consider this framework:</w:t>
+            </w:r>
+          </w:p>
+          <w:p>
+            <w:pPr>
+              <w:spacing w:before="40" w:after="40"/>
+              <w:ind w:left="360" w:hanging="216"/>
+            </w:pPr>
+            <w:r>
+              <w:rPr>
+                <w:rFonts w:ascii="Arial" w:hAnsi="Arial"/>
+                <w:b w:val="0"/>
+                <w:i w:val="0"/>
+                <w:color w:val="333333"/>
+                <w:sz w:val="20"/>
+              </w:rPr>
+              <w:t xml:space="preserve">• </w:t>
+            </w:r>
+            <w:r>
+              <w:rPr>
+                <w:rFonts w:ascii="Arial" w:hAnsi="Arial"/>
+                <w:b w:val="0"/>
+                <w:i w:val="0"/>
+                <w:color w:val="333333"/>
+                <w:sz w:val="20"/>
+              </w:rPr>
+            </w:r>
+            <w:r>
+              <w:rPr>
+                <w:rFonts w:ascii="Arial" w:hAnsi="Arial"/>
+                <w:b/>
+                <w:i w:val="0"/>
+                <w:color w:val="333333"/>
+                <w:sz w:val="20"/>
+              </w:rPr>
+              <w:t>Conceptual and internal use</w:t>
+            </w:r>
+            <w:r>
+              <w:rPr>
+                <w:rFonts w:ascii="Arial" w:hAnsi="Arial"/>
+                <w:b w:val="0"/>
+                <w:i w:val="0"/>
+                <w:color w:val="333333"/>
+                <w:sz w:val="20"/>
+              </w:rPr>
+              <w:t xml:space="preserve"> (brainstorming, internal memos, research summaries): Check for factual accuracy before relying on the output.</w:t>
+            </w:r>
+          </w:p>
+          <w:p>
+            <w:pPr>
+              <w:spacing w:before="40" w:after="40"/>
+              <w:ind w:left="360" w:hanging="216"/>
+            </w:pPr>
+            <w:r>
+              <w:rPr>
+                <w:rFonts w:ascii="Arial" w:hAnsi="Arial"/>
+                <w:b w:val="0"/>
+                <w:i w:val="0"/>
+                <w:color w:val="333333"/>
+                <w:sz w:val="20"/>
+              </w:rPr>
+              <w:t xml:space="preserve">• </w:t>
+            </w:r>
+            <w:r>
+              <w:rPr>
+                <w:rFonts w:ascii="Arial" w:hAnsi="Arial"/>
+                <w:b w:val="0"/>
+                <w:i w:val="0"/>
+                <w:color w:val="333333"/>
+                <w:sz w:val="20"/>
+              </w:rPr>
+            </w:r>
+            <w:r>
+              <w:rPr>
+                <w:rFonts w:ascii="Arial" w:hAnsi="Arial"/>
+                <w:b/>
+                <w:i w:val="0"/>
+                <w:color w:val="333333"/>
+                <w:sz w:val="20"/>
+              </w:rPr>
+              <w:t>Client-facing deliverables</w:t>
+            </w:r>
+            <w:r>
+              <w:rPr>
+                <w:rFonts w:ascii="Arial" w:hAnsi="Arial"/>
+                <w:b w:val="0"/>
+                <w:i w:val="0"/>
+                <w:color w:val="333333"/>
+                <w:sz w:val="20"/>
+              </w:rPr>
+              <w:t xml:space="preserve"> (reports, presentations, renderings shown to clients): Have a project manager or senior staff member review before delivery.</w:t>
+            </w:r>
+          </w:p>
+          <w:p>
+            <w:pPr>
+              <w:spacing w:before="40" w:after="40"/>
+              <w:ind w:left="360" w:hanging="216"/>
+            </w:pPr>
+            <w:r>
+              <w:rPr>
+                <w:rFonts w:ascii="Arial" w:hAnsi="Arial"/>
+                <w:b w:val="0"/>
+                <w:i w:val="0"/>
+                <w:color w:val="333333"/>
+                <w:sz w:val="20"/>
+              </w:rPr>
+              <w:t xml:space="preserve">• </w:t>
+            </w:r>
+            <w:r>
+              <w:rPr>
+                <w:rFonts w:ascii="Arial" w:hAnsi="Arial"/>
+                <w:b w:val="0"/>
+                <w:i w:val="0"/>
+                <w:color w:val="333333"/>
+                <w:sz w:val="20"/>
+              </w:rPr>
+            </w:r>
+            <w:r>
+              <w:rPr>
+                <w:rFonts w:ascii="Arial" w:hAnsi="Arial"/>
+                <w:b/>
+                <w:i w:val="0"/>
+                <w:color w:val="333333"/>
+                <w:sz w:val="20"/>
+              </w:rPr>
+              <w:t>Technical and code-compliance work</w:t>
+            </w:r>
+            <w:r>
+              <w:rPr>
+                <w:rFonts w:ascii="Arial" w:hAnsi="Arial"/>
+                <w:b w:val="0"/>
+                <w:i w:val="0"/>
+                <w:color w:val="333333"/>
+                <w:sz w:val="20"/>
+              </w:rPr>
+              <w:t xml:space="preserve"> (calculations, code analysis, specification language, drawing annotations): Have a licensed professional in the appropriate discipline review before it goes into documents of record.</w:t>
+            </w:r>
+          </w:p>
+          <w:p>
+            <w:pPr>
+              <w:spacing w:before="40" w:after="40"/>
+              <w:ind w:left="360" w:hanging="216"/>
+            </w:pPr>
+            <w:r>
+              <w:rPr>
+                <w:rFonts w:ascii="Arial" w:hAnsi="Arial"/>
+                <w:b w:val="0"/>
+                <w:i w:val="0"/>
+                <w:color w:val="333333"/>
+                <w:sz w:val="20"/>
+              </w:rPr>
+              <w:t xml:space="preserve">• </w:t>
+            </w:r>
+            <w:r>
+              <w:rPr>
+                <w:rFonts w:ascii="Arial" w:hAnsi="Arial"/>
+                <w:b w:val="0"/>
+                <w:i w:val="0"/>
+                <w:color w:val="333333"/>
+                <w:sz w:val="20"/>
+              </w:rPr>
+            </w:r>
+            <w:r>
+              <w:rPr>
+                <w:rFonts w:ascii="Arial" w:hAnsi="Arial"/>
+                <w:b/>
+                <w:i w:val="0"/>
+                <w:color w:val="333333"/>
+                <w:sz w:val="20"/>
+              </w:rPr>
+              <w:t>Stamped or sealed documents:</w:t>
+            </w:r>
+            <w:r>
+              <w:rPr>
+                <w:rFonts w:ascii="Arial" w:hAnsi="Arial"/>
+                <w:b w:val="0"/>
+                <w:i w:val="0"/>
+                <w:color w:val="333333"/>
+                <w:sz w:val="20"/>
+              </w:rPr>
+              <w:t xml:space="preserve"> The professional of record must independently verify any AI-assisted content before it's incorporated.</w:t>
+            </w:r>
+          </w:p>
+        </w:tc>
+      </w:tr>
+    </w:tbl>
     <w:p>
       <w:pPr>
-        <w:spacing w:before="80" w:after="80"/>
-        <w:ind w:left="360"/>
-      </w:pPr>
-      <w:r>
-        <w:rPr>
-          <w:rFonts w:ascii="Arial" w:hAnsi="Arial"/>
-          <w:b w:val="0"/>
-          <w:i/>
-          <w:color w:val="666666"/>
-          <w:sz w:val="20"/>
-        </w:rPr>
-      </w:r>
-      <w:r>
-        <w:rPr>
-          <w:rFonts w:ascii="Arial" w:hAnsi="Arial"/>
-          <w:b/>
-          <w:i w:val="0"/>
-          <w:color w:val="666666"/>
-          <w:sz w:val="20"/>
-        </w:rPr>
-        <w:t>Firms:</w:t>
-      </w:r>
-      <w:r>
-        <w:rPr>
-          <w:rFonts w:ascii="Arial" w:hAnsi="Arial"/>
-          <w:b w:val="0"/>
-          <w:i/>
-          <w:color w:val="666666"/>
-          <w:sz w:val="20"/>
-        </w:rPr>
-        <w:t xml:space="preserve"> Define your review requirements based on your practice areas and risk tolerance. Some insurance carriers are issuing specific guidance on AI-generated work product — check with your broker. At a minimum, consider this framework:</w:t>
-      </w:r>
-    </w:p>
-    <w:p>
-      <w:pPr>
-        <w:pStyle w:val="ListBullet"/>
         <w:spacing w:before="40" w:after="40"/>
-        <w:ind w:left="1080"/>
-      </w:pPr>
-      <w:r>
-        <w:rPr>
-          <w:rFonts w:ascii="Arial" w:hAnsi="Arial"/>
-          <w:b w:val="0"/>
-          <w:i/>
-          <w:color w:val="666666"/>
-          <w:sz w:val="20"/>
-        </w:rPr>
-      </w:r>
-      <w:r>
-        <w:rPr>
-          <w:rFonts w:ascii="Arial" w:hAnsi="Arial"/>
-          <w:b/>
-          <w:i w:val="0"/>
-          <w:color w:val="666666"/>
-          <w:sz w:val="20"/>
-        </w:rPr>
-        <w:t>Conceptual and internal use</w:t>
-      </w:r>
-      <w:r>
-        <w:rPr>
-          <w:rFonts w:ascii="Arial" w:hAnsi="Arial"/>
-          <w:b w:val="0"/>
-          <w:i/>
-          <w:color w:val="666666"/>
-          <w:sz w:val="20"/>
-        </w:rPr>
-        <w:t xml:space="preserve"> (brainstorming, internal memos, research summaries): Check for factual accuracy before relying on the output.</w:t>
-      </w:r>
-    </w:p>
-    <w:p>
-      <w:pPr>
-        <w:pStyle w:val="ListBullet"/>
-        <w:spacing w:before="40" w:after="40"/>
-        <w:ind w:left="1080"/>
-      </w:pPr>
-      <w:r>
-        <w:rPr>
-          <w:rFonts w:ascii="Arial" w:hAnsi="Arial"/>
-          <w:b w:val="0"/>
-          <w:i/>
-          <w:color w:val="666666"/>
-          <w:sz w:val="20"/>
-        </w:rPr>
-      </w:r>
-      <w:r>
-        <w:rPr>
-          <w:rFonts w:ascii="Arial" w:hAnsi="Arial"/>
-          <w:b/>
-          <w:i w:val="0"/>
-          <w:color w:val="666666"/>
-          <w:sz w:val="20"/>
-        </w:rPr>
-        <w:t>Client-facing deliverables</w:t>
-      </w:r>
-      <w:r>
-        <w:rPr>
-          <w:rFonts w:ascii="Arial" w:hAnsi="Arial"/>
-          <w:b w:val="0"/>
-          <w:i/>
-          <w:color w:val="666666"/>
-          <w:sz w:val="20"/>
-        </w:rPr>
-        <w:t xml:space="preserve"> (reports, presentations, renderings shown to clients): Have a project manager or senior staff member review before delivery.</w:t>
-      </w:r>
-    </w:p>
-    <w:p>
-      <w:pPr>
-        <w:pStyle w:val="ListBullet"/>
-        <w:spacing w:before="40" w:after="40"/>
-        <w:ind w:left="1080"/>
-      </w:pPr>
-      <w:r>
-        <w:rPr>
-          <w:rFonts w:ascii="Arial" w:hAnsi="Arial"/>
-          <w:b w:val="0"/>
-          <w:i/>
-          <w:color w:val="666666"/>
-          <w:sz w:val="20"/>
-        </w:rPr>
-      </w:r>
-      <w:r>
-        <w:rPr>
-          <w:rFonts w:ascii="Arial" w:hAnsi="Arial"/>
-          <w:b/>
-          <w:i w:val="0"/>
-          <w:color w:val="666666"/>
-          <w:sz w:val="20"/>
-        </w:rPr>
-        <w:t>Technical and code-compliance work</w:t>
-      </w:r>
-      <w:r>
-        <w:rPr>
-          <w:rFonts w:ascii="Arial" w:hAnsi="Arial"/>
-          <w:b w:val="0"/>
-          <w:i/>
-          <w:color w:val="666666"/>
-          <w:sz w:val="20"/>
-        </w:rPr>
-        <w:t xml:space="preserve"> (calculations, code analysis, specification language, drawing annotations): Have a licensed professional in the appropriate discipline review before it goes into documents of record.</w:t>
-      </w:r>
-    </w:p>
-    <w:p>
-      <w:pPr>
-        <w:pStyle w:val="ListBullet"/>
-        <w:spacing w:before="40" w:after="40"/>
-        <w:ind w:left="1080"/>
-      </w:pPr>
-      <w:r>
-        <w:rPr>
-          <w:rFonts w:ascii="Arial" w:hAnsi="Arial"/>
-          <w:b w:val="0"/>
-          <w:i/>
-          <w:color w:val="666666"/>
-          <w:sz w:val="20"/>
-        </w:rPr>
-      </w:r>
-      <w:r>
-        <w:rPr>
-          <w:rFonts w:ascii="Arial" w:hAnsi="Arial"/>
-          <w:b/>
-          <w:i w:val="0"/>
-          <w:color w:val="666666"/>
-          <w:sz w:val="20"/>
-        </w:rPr>
-        <w:t>Stamped or sealed documents:</w:t>
-      </w:r>
-      <w:r>
-        <w:rPr>
-          <w:rFonts w:ascii="Arial" w:hAnsi="Arial"/>
-          <w:b w:val="0"/>
-          <w:i/>
-          <w:color w:val="666666"/>
-          <w:sz w:val="20"/>
-        </w:rPr>
-        <w:t xml:space="preserve"> The professional of record must independently verify any AI-assisted content before it's incorporated.</w:t>
-      </w:r>
+      </w:pPr>
     </w:p>
     <w:p>
       <w:pPr>
@@ -3067,40 +3151,64 @@
         <w:t xml:space="preserve"> Reporting quickly is not punished — waiting to report it creates legal risk.</w:t>
       </w:r>
     </w:p>
+    <w:tbl>
+      <w:tblPr>
+        <w:jc w:val="center"/>
+        <w:tblLook w:firstColumn="1" w:firstRow="1" w:lastColumn="0" w:lastRow="0" w:noHBand="0" w:noVBand="1" w:val="04A0"/>
+        <w:tblW w:w="9360" w:type="dxa"/>
+      </w:tblPr>
+      <w:tblGrid>
+        <w:gridCol w:w="9360"/>
+      </w:tblGrid>
+      <w:tr>
+        <w:tc>
+          <w:tcPr>
+            <w:tcW w:type="dxa" w:w="9360"/>
+            <w:shd w:fill="E8F4E8" w:val="clear"/>
+            <w:tcBorders>
+              <w:left w:val="single" w:sz="24" w:space="0" w:color="2E7D32"/>
+              <w:top w:val="single" w:sz="4" w:space="0" w:color="E8F4E8"/>
+              <w:bottom w:val="single" w:sz="4" w:space="0" w:color="E8F4E8"/>
+              <w:right w:val="single" w:sz="4" w:space="0" w:color="E8F4E8"/>
+            </w:tcBorders>
+          </w:tcPr>
+          <w:p>
+            <w:pPr>
+              <w:spacing w:before="80" w:after="120"/>
+            </w:pPr>
+            <w:r>
+              <w:rPr>
+                <w:rFonts w:ascii="Arial" w:hAnsi="Arial"/>
+                <w:b/>
+                <w:i w:val="0"/>
+                <w:color w:val="2E7D32"/>
+                <w:sz w:val="21"/>
+              </w:rPr>
+              <w:t>Firm administrators</w:t>
+            </w:r>
+          </w:p>
+          <w:p>
+            <w:pPr>
+              <w:spacing w:before="40" w:after="40"/>
+            </w:pPr>
+            <w:r>
+              <w:rPr>
+                <w:rFonts w:ascii="Arial" w:hAnsi="Arial"/>
+                <w:b w:val="0"/>
+                <w:i w:val="0"/>
+                <w:color w:val="333333"/>
+                <w:sz w:val="20"/>
+              </w:rPr>
+              <w:t>Insert your actual IT contact method above.</w:t>
+            </w:r>
+          </w:p>
+        </w:tc>
+      </w:tr>
+    </w:tbl>
     <w:p>
       <w:pPr>
-        <w:spacing w:before="120" w:after="120"/>
-        <w:ind w:left="360"/>
-      </w:pPr>
-      <w:r>
-        <w:rPr>
-          <w:rFonts w:ascii="Arial" w:hAnsi="Arial"/>
-          <w:b w:val="0"/>
-          <w:i/>
-          <w:color w:val="666666"/>
-          <w:sz w:val="20"/>
-        </w:rPr>
-      </w:r>
-      <w:r>
-        <w:rPr>
-          <w:rFonts w:ascii="Arial" w:hAnsi="Arial"/>
-          <w:b/>
-          <w:i w:val="0"/>
-          <w:color w:val="666666"/>
-          <w:sz w:val="20"/>
-        </w:rPr>
-        <w:t>Firms:</w:t>
-      </w:r>
-      <w:r>
-        <w:rPr>
-          <w:rFonts w:ascii="Arial" w:hAnsi="Arial"/>
-          <w:b w:val="0"/>
-          <w:i/>
-          <w:color w:val="666666"/>
-          <w:sz w:val="20"/>
-        </w:rPr>
-        <w:t xml:space="preserve"> Insert your actual IT contact method above.</w:t>
-      </w:r>
+        <w:spacing w:before="40" w:after="40"/>
+      </w:pPr>
     </w:p>
     <w:p>
       <w:pPr>
@@ -3419,40 +3527,64 @@
         <w:t>12. Training</w:t>
       </w:r>
     </w:p>
+    <w:tbl>
+      <w:tblPr>
+        <w:jc w:val="center"/>
+        <w:tblLook w:firstColumn="1" w:firstRow="1" w:lastColumn="0" w:lastRow="0" w:noHBand="0" w:noVBand="1" w:val="04A0"/>
+        <w:tblW w:w="9360" w:type="dxa"/>
+      </w:tblPr>
+      <w:tblGrid>
+        <w:gridCol w:w="9360"/>
+      </w:tblGrid>
+      <w:tr>
+        <w:tc>
+          <w:tcPr>
+            <w:tcW w:type="dxa" w:w="9360"/>
+            <w:shd w:fill="E8F4E8" w:val="clear"/>
+            <w:tcBorders>
+              <w:left w:val="single" w:sz="24" w:space="0" w:color="2E7D32"/>
+              <w:top w:val="single" w:sz="4" w:space="0" w:color="E8F4E8"/>
+              <w:bottom w:val="single" w:sz="4" w:space="0" w:color="E8F4E8"/>
+              <w:right w:val="single" w:sz="4" w:space="0" w:color="E8F4E8"/>
+            </w:tcBorders>
+          </w:tcPr>
+          <w:p>
+            <w:pPr>
+              <w:spacing w:before="80" w:after="120"/>
+            </w:pPr>
+            <w:r>
+              <w:rPr>
+                <w:rFonts w:ascii="Arial" w:hAnsi="Arial"/>
+                <w:b/>
+                <w:i w:val="0"/>
+                <w:color w:val="2E7D32"/>
+                <w:sz w:val="21"/>
+              </w:rPr>
+              <w:t>Firm administrators</w:t>
+            </w:r>
+          </w:p>
+          <w:p>
+            <w:pPr>
+              <w:spacing w:before="40" w:after="40"/>
+            </w:pPr>
+            <w:r>
+              <w:rPr>
+                <w:rFonts w:ascii="Arial" w:hAnsi="Arial"/>
+                <w:b w:val="0"/>
+                <w:i w:val="0"/>
+                <w:color w:val="333333"/>
+                <w:sz w:val="20"/>
+              </w:rPr>
+              <w:t>Consider requiring a short training session on this policy and your approved AI tools before giving staff access to Tier 1 or Tier 2 tools. An annual re-acknowledgment of this policy is a good idea. Training doesn't need to be complicated — a 30-minute walkthrough of the data levels, tool tiers, and what to do if something goes wrong is enough for most staff.</w:t>
+            </w:r>
+          </w:p>
+        </w:tc>
+      </w:tr>
+    </w:tbl>
     <w:p>
       <w:pPr>
-        <w:spacing w:before="120" w:after="120"/>
-        <w:ind w:left="360"/>
-      </w:pPr>
-      <w:r>
-        <w:rPr>
-          <w:rFonts w:ascii="Arial" w:hAnsi="Arial"/>
-          <w:b w:val="0"/>
-          <w:i/>
-          <w:color w:val="666666"/>
-          <w:sz w:val="20"/>
-        </w:rPr>
-      </w:r>
-      <w:r>
-        <w:rPr>
-          <w:rFonts w:ascii="Arial" w:hAnsi="Arial"/>
-          <w:b/>
-          <w:i w:val="0"/>
-          <w:color w:val="666666"/>
-          <w:sz w:val="20"/>
-        </w:rPr>
-        <w:t>Firms:</w:t>
-      </w:r>
-      <w:r>
-        <w:rPr>
-          <w:rFonts w:ascii="Arial" w:hAnsi="Arial"/>
-          <w:b w:val="0"/>
-          <w:i/>
-          <w:color w:val="666666"/>
-          <w:sz w:val="20"/>
-        </w:rPr>
-        <w:t xml:space="preserve"> Consider requiring a short training session on this policy and your approved AI tools before giving staff access to Tier 1 or Tier 2 tools. An annual re-acknowledgment of this policy is a good idea. Training doesn't need to be complicated — a 30-minute walkthrough of the data levels, tool tiers, and what to do if something goes wrong is enough for most staff.</w:t>
-      </w:r>
+        <w:spacing w:before="40" w:after="40"/>
+      </w:pPr>
     </w:p>
     <w:p>
       <w:pPr>

</xml_diff>

<commit_message>
Remove em dashes from section headings across all policies
Cleaner table of contents display — "4.1 Laptops and Tablets" instead of
"4.1 — Laptops and Tablets". Body text em dashes preserved.
Regenerated all DOCX files.
</commit_message>
<xml_diff>
--- a/policies/aec/AI-Acceptable-Use-Policy-AEC.docx
+++ b/policies/aec/AI-Acceptable-Use-Policy-AEC.docx
@@ -497,7 +497,7 @@
         <w:pStyle w:val="Heading3"/>
       </w:pPr>
       <w:r>
-        <w:t>Tier 1 — Pre-Approved (IT-managed, enterprise protections confirmed)</w:t>
+        <w:t>Tier 1 Pre-Approved (IT-managed, enterprise protections confirmed)</w:t>
       </w:r>
     </w:p>
     <w:p>
@@ -1057,7 +1057,7 @@
         <w:pStyle w:val="Heading3"/>
       </w:pPr>
       <w:r>
-        <w:t>Tier 2 — Approved with Restrictions (enterprise protections confirmed, requires IT setup)</w:t>
+        <w:t>Tier 2 Approved with Restrictions (enterprise protections confirmed, requires IT setup)</w:t>
       </w:r>
     </w:p>
     <w:p>
@@ -1387,7 +1387,7 @@
         <w:pStyle w:val="Heading3"/>
       </w:pPr>
       <w:r>
-        <w:t>Tier 3 — Approved for General Knowledge Only (No ZDR or unverified)</w:t>
+        <w:t>Tier 3 Approved for General Knowledge Only (No ZDR or unverified)</w:t>
       </w:r>
     </w:p>
     <w:p>
@@ -1445,7 +1445,7 @@
         <w:pStyle w:val="Heading3"/>
       </w:pPr>
       <w:r>
-        <w:t>Tier 4 — Prohibited</w:t>
+        <w:t>Tier 4 Prohibited</w:t>
       </w:r>
     </w:p>
     <w:p>
@@ -1734,7 +1734,7 @@
         <w:pStyle w:val="Heading3"/>
       </w:pPr>
       <w:r>
-        <w:t>Level 1 — Public / General Knowledge</w:t>
+        <w:t>Level 1 Public / General Knowledge</w:t>
       </w:r>
     </w:p>
     <w:p>
@@ -1816,7 +1816,7 @@
         <w:pStyle w:val="Heading3"/>
       </w:pPr>
       <w:r>
-        <w:t>Level 2 — Internal / Low Sensitivity</w:t>
+        <w:t>Level 2 Internal / Low Sensitivity</w:t>
       </w:r>
     </w:p>
     <w:p>
@@ -1898,7 +1898,7 @@
         <w:pStyle w:val="Heading3"/>
       </w:pPr>
       <w:r>
-        <w:t>Level 3 — Confidential / Project Data</w:t>
+        <w:t>Level 3 Confidential / Project Data</w:t>
       </w:r>
     </w:p>
     <w:p>
@@ -1980,7 +1980,7 @@
         <w:pStyle w:val="Heading3"/>
       </w:pPr>
       <w:r>
-        <w:t>Level 4 — Restricted</w:t>
+        <w:t>Level 4 Restricted</w:t>
       </w:r>
     </w:p>
     <w:p>
@@ -2078,7 +2078,7 @@
         <w:pStyle w:val="Heading3"/>
       </w:pPr>
       <w:r>
-        <w:t>7.1 — Professional Review of AI-Generated Output</w:t>
+        <w:t>7.1 Professional Review of AI-Generated Output</w:t>
       </w:r>
     </w:p>
     <w:p>
@@ -2389,7 +2389,7 @@
         <w:pStyle w:val="Heading3"/>
       </w:pPr>
       <w:r>
-        <w:t>7.2 — Disclosure and Transparency</w:t>
+        <w:t>7.2 Disclosure and Transparency</w:t>
       </w:r>
     </w:p>
     <w:p>
@@ -2445,7 +2445,7 @@
         <w:pStyle w:val="Heading3"/>
       </w:pPr>
       <w:r>
-        <w:t>7.3 — Intellectual Property and Copyright</w:t>
+        <w:t>7.3 Intellectual Property and Copyright</w:t>
       </w:r>
     </w:p>
     <w:p>
@@ -2501,7 +2501,7 @@
         <w:pStyle w:val="Heading3"/>
       </w:pPr>
       <w:r>
-        <w:t>7.4 — AI for Code and Computational Design</w:t>
+        <w:t>7.4 AI for Code and Computational Design</w:t>
       </w:r>
     </w:p>
     <w:p>
@@ -2524,7 +2524,7 @@
         <w:pStyle w:val="Heading3"/>
       </w:pPr>
       <w:r>
-        <w:t>7.5 — Data Minimization</w:t>
+        <w:t>7.5 Data Minimization</w:t>
       </w:r>
     </w:p>
     <w:p>
@@ -2547,7 +2547,7 @@
         <w:pStyle w:val="Heading3"/>
       </w:pPr>
       <w:r>
-        <w:t>7.6 — Records Retention and Discoverability</w:t>
+        <w:t>7.6 Records Retention and Discoverability</w:t>
       </w:r>
     </w:p>
     <w:p>
@@ -2570,7 +2570,7 @@
         <w:pStyle w:val="Heading3"/>
       </w:pPr>
       <w:r>
-        <w:t>7.7 — Output Storage</w:t>
+        <w:t>7.7 Output Storage</w:t>
       </w:r>
     </w:p>
     <w:p>
@@ -2593,7 +2593,7 @@
         <w:pStyle w:val="Heading3"/>
       </w:pPr>
       <w:r>
-        <w:t>7.8 — AI in Client Communications</w:t>
+        <w:t>7.8 AI in Client Communications</w:t>
       </w:r>
     </w:p>
     <w:p>

</xml_diff>